<commit_message>
Projektinformation LISA: online, kostenfrei, Telefon
Co-Authored-By: Claude Opus 5.5 <noreply@anthropic.com>
</commit_message>
<xml_diff>
--- a/00_Kurskonzept/08_LISA_Anerkennung/06_Projektinformation_LISA.docx
+++ b/00_Kurskonzept/08_LISA_Anerkennung/06_Projektinformation_LISA.docx
@@ -414,8 +414,8 @@
         <w:tblLayout w:type="fixed"/>
       </w:tblPr>
       <w:tblGrid>
-        <w:gridCol w:w="3009"/>
-        <w:gridCol w:w="6600"/>
+        <w:gridCol w:w="3300"/>
+        <w:gridCol w:w="6309"/>
       </w:tblGrid>
       <w:tr>
         <w:trPr>
@@ -423,7 +423,7 @@
         </w:trPr>
         <w:tc>
           <w:tcPr>
-            <w:tcW w:type="dxa" w:w="3009"/>
+            <w:tcW w:type="dxa" w:w="3300"/>
             <w:shd w:fill="FDF0E3" w:color="auto" w:val="clear"/>
             <w:tcMar>
               <w:top w:type="dxa" w:w="60"/>
@@ -444,7 +444,7 @@
         </w:tc>
         <w:tc>
           <w:tcPr>
-            <w:tcW w:type="dxa" w:w="6600"/>
+            <w:tcW w:type="dxa" w:w="6309"/>
             <w:shd w:fill="FDF0E3" w:color="auto" w:val="clear"/>
             <w:tcMar>
               <w:top w:type="dxa" w:w="60"/>
@@ -467,23 +467,23 @@
       <w:tr>
         <w:tc>
           <w:tcPr>
-            <w:tcW w:type="dxa" w:w="3009"/>
-            <w:tcMar>
-              <w:top w:type="dxa" w:w="60"/>
-              <w:left w:type="dxa" w:w="100"/>
-              <w:bottom w:type="dxa" w:w="60"/>
-              <w:right w:type="dxa" w:w="100"/>
-            </w:tcMar>
-          </w:tcPr>
-          <w:p>
-            <w:r>
-              <w:t xml:space="preserve">3 Präsenzsitzungen</w:t>
-            </w:r>
-          </w:p>
-        </w:tc>
-        <w:tc>
-          <w:tcPr>
-            <w:tcW w:type="dxa" w:w="6600"/>
+            <w:tcW w:type="dxa" w:w="3300"/>
+            <w:tcMar>
+              <w:top w:type="dxa" w:w="60"/>
+              <w:left w:type="dxa" w:w="100"/>
+              <w:bottom w:type="dxa" w:w="60"/>
+              <w:right w:type="dxa" w:w="100"/>
+            </w:tcMar>
+          </w:tcPr>
+          <w:p>
+            <w:r>
+              <w:t xml:space="preserve">3 Live-Sitzungen (online)</w:t>
+            </w:r>
+          </w:p>
+        </w:tc>
+        <w:tc>
+          <w:tcPr>
+            <w:tcW w:type="dxa" w:w="6309"/>
             <w:tcMar>
               <w:top w:type="dxa" w:w="60"/>
               <w:left w:type="dxa" w:w="100"/>
@@ -501,7 +501,7 @@
       <w:tr>
         <w:tc>
           <w:tcPr>
-            <w:tcW w:type="dxa" w:w="3009"/>
+            <w:tcW w:type="dxa" w:w="3300"/>
             <w:tcMar>
               <w:top w:type="dxa" w:w="60"/>
               <w:left w:type="dxa" w:w="100"/>
@@ -517,7 +517,7 @@
         </w:tc>
         <w:tc>
           <w:tcPr>
-            <w:tcW w:type="dxa" w:w="6600"/>
+            <w:tcW w:type="dxa" w:w="6309"/>
             <w:tcMar>
               <w:top w:type="dxa" w:w="60"/>
               <w:left w:type="dxa" w:w="100"/>
@@ -535,7 +535,7 @@
       <w:tr>
         <w:tc>
           <w:tcPr>
-            <w:tcW w:type="dxa" w:w="3009"/>
+            <w:tcW w:type="dxa" w:w="3300"/>
             <w:tcMar>
               <w:top w:type="dxa" w:w="60"/>
               <w:left w:type="dxa" w:w="100"/>
@@ -551,7 +551,7 @@
         </w:tc>
         <w:tc>
           <w:tcPr>
-            <w:tcW w:type="dxa" w:w="6600"/>
+            <w:tcW w:type="dxa" w:w="6309"/>
             <w:tcMar>
               <w:top w:type="dxa" w:w="60"/>
               <w:left w:type="dxa" w:w="100"/>
@@ -589,17 +589,17 @@
         <w:spacing w:after="120"/>
       </w:pPr>
       <w:r>
-        <w:t xml:space="preserve">Die Reihe ist als </w:t>
+        <w:t xml:space="preserve">Die Reihe findet </w:t>
       </w:r>
       <w:r>
         <w:rPr>
           <w:b/>
           <w:bCs/>
         </w:rPr>
-        <w:t xml:space="preserve">Blended Learning</w:t>
-      </w:r>
-      <w:r>
-        <w:t xml:space="preserve"> angelegt:</w:t>
+        <w:t xml:space="preserve">online</w:t>
+      </w:r>
+      <w:r>
+        <w:t xml:space="preserve"> statt und verbindet Live-Sitzungen mit Selbstlernphasen und einer Praxisphase:</w:t>
       </w:r>
     </w:p>
     <w:p>
@@ -615,10 +615,10 @@
           <w:b/>
           <w:bCs/>
         </w:rPr>
-        <w:t xml:space="preserve">Vor Ort (Präsenz):</w:t>
-      </w:r>
-      <w:r>
-        <w:t xml:space="preserve"> Die drei Sitzungen finden an der Otto-von-Guericke-Universität Magdeburg statt ([Raum, Anschrift]). Die Teilnehmenden arbeiten praktisch am Roboter. mBot2-Roboter und Laptops werden gestellt.</w:t>
+        <w:t xml:space="preserve">Online (synchron):</w:t>
+      </w:r>
+      <w:r>
+        <w:t xml:space="preserve"> Die drei Sitzungen finden live als Videokonferenz statt. Die Teilnehmenden arbeiten dabei praktisch am mBot2 und mit Open Roberta Lab im Browser.</w:t>
       </w:r>
     </w:p>
     <w:p>
@@ -681,7 +681,7 @@
         <w:t xml:space="preserve">Kosten:</w:t>
       </w:r>
       <w:r>
-        <w:t xml:space="preserve"> [kostenfrei / Betrag]</w:t>
+        <w:t xml:space="preserve"> kostenfrei</w:t>
       </w:r>
     </w:p>
     <w:p>
@@ -1209,7 +1209,7 @@
           </w:tcPr>
           <w:p>
             <w:r>
-              <w:t xml:space="preserve">[Telefon]</w:t>
+              <w:t xml:space="preserve">0391 67-56373</w:t>
             </w:r>
           </w:p>
         </w:tc>

</xml_diff>

<commit_message>
Projektinformation LISA: hybrid, Ort G40-B Raum 024, eigene Geräte
Co-Authored-By: Claude Opus 5.5 <noreply@anthropic.com>
</commit_message>
<xml_diff>
--- a/00_Kurskonzept/08_LISA_Anerkennung/06_Projektinformation_LISA.docx
+++ b/00_Kurskonzept/08_LISA_Anerkennung/06_Projektinformation_LISA.docx
@@ -414,8 +414,8 @@
         <w:tblLayout w:type="fixed"/>
       </w:tblPr>
       <w:tblGrid>
-        <w:gridCol w:w="3300"/>
-        <w:gridCol w:w="6309"/>
+        <w:gridCol w:w="3882"/>
+        <w:gridCol w:w="5727"/>
       </w:tblGrid>
       <w:tr>
         <w:trPr>
@@ -423,7 +423,7 @@
         </w:trPr>
         <w:tc>
           <w:tcPr>
-            <w:tcW w:type="dxa" w:w="3300"/>
+            <w:tcW w:type="dxa" w:w="3882"/>
             <w:shd w:fill="FDF0E3" w:color="auto" w:val="clear"/>
             <w:tcMar>
               <w:top w:type="dxa" w:w="60"/>
@@ -444,7 +444,7 @@
         </w:tc>
         <w:tc>
           <w:tcPr>
-            <w:tcW w:type="dxa" w:w="6309"/>
+            <w:tcW w:type="dxa" w:w="5727"/>
             <w:shd w:fill="FDF0E3" w:color="auto" w:val="clear"/>
             <w:tcMar>
               <w:top w:type="dxa" w:w="60"/>
@@ -467,23 +467,23 @@
       <w:tr>
         <w:tc>
           <w:tcPr>
-            <w:tcW w:type="dxa" w:w="3300"/>
-            <w:tcMar>
-              <w:top w:type="dxa" w:w="60"/>
-              <w:left w:type="dxa" w:w="100"/>
-              <w:bottom w:type="dxa" w:w="60"/>
-              <w:right w:type="dxa" w:w="100"/>
-            </w:tcMar>
-          </w:tcPr>
-          <w:p>
-            <w:r>
-              <w:t xml:space="preserve">3 Live-Sitzungen (online)</w:t>
-            </w:r>
-          </w:p>
-        </w:tc>
-        <w:tc>
-          <w:tcPr>
-            <w:tcW w:type="dxa" w:w="6309"/>
+            <w:tcW w:type="dxa" w:w="3882"/>
+            <w:tcMar>
+              <w:top w:type="dxa" w:w="60"/>
+              <w:left w:type="dxa" w:w="100"/>
+              <w:bottom w:type="dxa" w:w="60"/>
+              <w:right w:type="dxa" w:w="100"/>
+            </w:tcMar>
+          </w:tcPr>
+          <w:p>
+            <w:r>
+              <w:t xml:space="preserve">3 Sitzungen (hybrid: vor Ort oder online)</w:t>
+            </w:r>
+          </w:p>
+        </w:tc>
+        <w:tc>
+          <w:tcPr>
+            <w:tcW w:type="dxa" w:w="5727"/>
             <w:tcMar>
               <w:top w:type="dxa" w:w="60"/>
               <w:left w:type="dxa" w:w="100"/>
@@ -501,7 +501,7 @@
       <w:tr>
         <w:tc>
           <w:tcPr>
-            <w:tcW w:type="dxa" w:w="3300"/>
+            <w:tcW w:type="dxa" w:w="3882"/>
             <w:tcMar>
               <w:top w:type="dxa" w:w="60"/>
               <w:left w:type="dxa" w:w="100"/>
@@ -517,7 +517,7 @@
         </w:tc>
         <w:tc>
           <w:tcPr>
-            <w:tcW w:type="dxa" w:w="6309"/>
+            <w:tcW w:type="dxa" w:w="5727"/>
             <w:tcMar>
               <w:top w:type="dxa" w:w="60"/>
               <w:left w:type="dxa" w:w="100"/>
@@ -535,7 +535,7 @@
       <w:tr>
         <w:tc>
           <w:tcPr>
-            <w:tcW w:type="dxa" w:w="3300"/>
+            <w:tcW w:type="dxa" w:w="3882"/>
             <w:tcMar>
               <w:top w:type="dxa" w:w="60"/>
               <w:left w:type="dxa" w:w="100"/>
@@ -551,7 +551,7 @@
         </w:tc>
         <w:tc>
           <w:tcPr>
-            <w:tcW w:type="dxa" w:w="6309"/>
+            <w:tcW w:type="dxa" w:w="5727"/>
             <w:tcMar>
               <w:top w:type="dxa" w:w="60"/>
               <w:left w:type="dxa" w:w="100"/>
@@ -589,17 +589,17 @@
         <w:spacing w:after="120"/>
       </w:pPr>
       <w:r>
-        <w:t xml:space="preserve">Die Reihe findet </w:t>
+        <w:t xml:space="preserve">Die Reihe ist </w:t>
       </w:r>
       <w:r>
         <w:rPr>
           <w:b/>
           <w:bCs/>
         </w:rPr>
-        <w:t xml:space="preserve">online</w:t>
-      </w:r>
-      <w:r>
-        <w:t xml:space="preserve"> statt und verbindet Live-Sitzungen mit Selbstlernphasen und einer Praxisphase:</w:t>
+        <w:t xml:space="preserve">hybrid</w:t>
+      </w:r>
+      <w:r>
+        <w:t xml:space="preserve"> angelegt: Die Sitzungen finden vor Ort statt, eine Teilnahme online ist möglich. Dazu kommen Selbstlernphasen und eine Praxisphase.</w:t>
       </w:r>
     </w:p>
     <w:p>
@@ -615,10 +615,48 @@
           <w:b/>
           <w:bCs/>
         </w:rPr>
-        <w:t xml:space="preserve">Online (synchron):</w:t>
-      </w:r>
-      <w:r>
-        <w:t xml:space="preserve"> Die drei Sitzungen finden live als Videokonferenz statt. Die Teilnehmenden arbeiten dabei praktisch am mBot2 und mit Open Roberta Lab im Browser.</w:t>
+        <w:t xml:space="preserve">Vor Ort:</w:t>
+      </w:r>
+      <w:r>
+        <w:t xml:space="preserve"> Otto-von-Guericke-Universität Magdeburg, Gebäude G40-B, Raum 024, Zschokkestraße 32, 39104 Magdeburg. Die Teilnehmenden arbeiten praktisch am mBot2 und programmieren ihn mit Open Roberta Lab im Browser.</w:t>
+      </w:r>
+    </w:p>
+    <w:p>
+      <w:pPr>
+        <w:pStyle w:val="ListParagraph"/>
+        <w:numPr>
+          <w:ilvl w:val="0"/>
+          <w:numId w:val="1"/>
+        </w:numPr>
+      </w:pPr>
+      <w:r>
+        <w:rPr>
+          <w:b/>
+          <w:bCs/>
+        </w:rPr>
+        <w:t xml:space="preserve">Online:</w:t>
+      </w:r>
+      <w:r>
+        <w:t xml:space="preserve"> Die Sitzungen werden zeitgleich per Videokonferenz übertragen.</w:t>
+      </w:r>
+    </w:p>
+    <w:p>
+      <w:pPr>
+        <w:pStyle w:val="ListParagraph"/>
+        <w:numPr>
+          <w:ilvl w:val="0"/>
+          <w:numId w:val="1"/>
+        </w:numPr>
+      </w:pPr>
+      <w:r>
+        <w:rPr>
+          <w:b/>
+          <w:bCs/>
+        </w:rPr>
+        <w:t xml:space="preserve">Eigene Geräte:</w:t>
+      </w:r>
+      <w:r>
+        <w:t xml:space="preserve"> Die Teilnehmenden können ihren eigenen Laptop oder Tablets ihrer Schule mitbringen und die Verbindung zum mBot2 damit direkt ausprobieren. So zeigt sich schon in der Fortbildung, ob die Technik der eigenen Schule funktioniert.</w:t>
       </w:r>
     </w:p>
     <w:p>

</xml_diff>